<commit_message>
fix(proposal): align training architecture and outputs
</commit_message>
<xml_diff>
--- a/outputs/TrustForge_完整商業化提案報告.docx
+++ b/outputs/TrustForge_完整商業化提案報告.docx
@@ -3107,7 +3107,7 @@
           <w:color w:val="000000"/>
           <w:sz w:val="22"/>
         </w:rPr>
-        <w:t>以 ModelHub governance 與 SageMaker execution backend 保持模型版本、artifact、指標與批准流程。</w:t>
+        <w:t>以可替換的 ModelHub 或 SageMaker TrainingBackend 執行訓練，兩者都產出 artifact 與指標；候選版本仍由 TrustForge upgrade control 管理批准流程。</w:t>
       </w:r>
     </w:p>
     <w:p>
@@ -3233,7 +3233,7 @@
           <w:color w:val="000000"/>
           <w:sz w:val="22"/>
         </w:rPr>
-        <w:t>由 SageMaker backend 執行 AWS 訓練任務，S3 保存輸入與 artifact；ModelHub 登記版本、指標、來源與狀態。</w:t>
+        <w:t>依 TRAINING_BACKEND 選擇 ModelHub 或 SageMaker 執行訓練；兩者皆產生 artifact 與指標，並將候選交回 TrustForge upgrade control 進行治理。</w:t>
       </w:r>
     </w:p>
     <w:p>
@@ -3314,7 +3314,7 @@
         <w:pStyle w:val="Heading2"/>
       </w:pPr>
       <w:r>
-        <w:t>4.4 ModelHub 與 SageMaker 的責任分工</w:t>
+        <w:t>4.4 ModelHub 與 SageMaker 的平行後端邊界</w:t>
       </w:r>
     </w:p>
     <w:tbl>
@@ -3462,7 +3462,7 @@
                 <w:color w:val="000000"/>
                 <w:sz w:val="22"/>
               </w:rPr>
-              <w:t>Governance surface</w:t>
+              <w:t>TrainingBackend 選項</w:t>
             </w:r>
           </w:p>
         </w:tc>
@@ -3486,7 +3486,7 @@
                 <w:color w:val="000000"/>
                 <w:sz w:val="22"/>
               </w:rPr>
-              <w:t>model version、training request、metrics、artifact provenance、candidate status、approval lifecycle</w:t>
+              <w:t>執行 fit、產生 model artifact 與 metrics，回傳候選結果</w:t>
             </w:r>
           </w:p>
         </w:tc>
@@ -3536,7 +3536,7 @@
                 <w:color w:val="000000"/>
                 <w:sz w:val="22"/>
               </w:rPr>
-              <w:t>Training execution backend</w:t>
+              <w:t>TrainingBackend 選項</w:t>
             </w:r>
           </w:p>
         </w:tc>
@@ -3560,7 +3560,81 @@
                 <w:color w:val="000000"/>
                 <w:sz w:val="22"/>
               </w:rPr>
-              <w:t>從 S3 讀取資料、建立 Training Job、產生模型 artifact、回傳訓練指標</w:t>
+              <w:t>從 S3 讀取資料、建立 Training Job、產生 model artifact 與 metrics</w:t>
+            </w:r>
+          </w:p>
+        </w:tc>
+      </w:tr>
+      <w:tr>
+        <w:tc>
+          <w:tcPr>
+            <w:tcW w:type="dxa" w:w="1900"/>
+            <w:vAlign w:val="center"/>
+            <w:tcMar>
+              <w:top w:w="100" w:type="dxa"/>
+              <w:start w:w="120" w:type="dxa"/>
+              <w:bottom w:w="100" w:type="dxa"/>
+              <w:end w:w="120" w:type="dxa"/>
+            </w:tcMar>
+          </w:tcPr>
+          <w:p>
+            <w:r>
+              <w:rPr>
+                <w:rFonts w:ascii="Calibri" w:hAnsi="Calibri" w:eastAsia="Microsoft JhengHei"/>
+                <w:b w:val="0"/>
+                <w:i w:val="0"/>
+                <w:color w:val="000000"/>
+                <w:sz w:val="22"/>
+              </w:rPr>
+              <w:t>TrustForge upgrade control</w:t>
+            </w:r>
+          </w:p>
+        </w:tc>
+        <w:tc>
+          <w:tcPr>
+            <w:tcW w:type="dxa" w:w="2400"/>
+            <w:vAlign w:val="center"/>
+            <w:tcMar>
+              <w:top w:w="100" w:type="dxa"/>
+              <w:start w:w="120" w:type="dxa"/>
+              <w:bottom w:w="100" w:type="dxa"/>
+              <w:end w:w="120" w:type="dxa"/>
+            </w:tcMar>
+          </w:tcPr>
+          <w:p>
+            <w:r>
+              <w:rPr>
+                <w:rFonts w:ascii="Calibri" w:hAnsi="Calibri" w:eastAsia="Microsoft JhengHei"/>
+                <w:b w:val="0"/>
+                <w:i w:val="0"/>
+                <w:color w:val="000000"/>
+                <w:sz w:val="22"/>
+              </w:rPr>
+              <w:t>共同治理平面</w:t>
+            </w:r>
+          </w:p>
+        </w:tc>
+        <w:tc>
+          <w:tcPr>
+            <w:tcW w:type="dxa" w:w="5060"/>
+            <w:vAlign w:val="center"/>
+            <w:tcMar>
+              <w:top w:w="100" w:type="dxa"/>
+              <w:start w:w="120" w:type="dxa"/>
+              <w:bottom w:w="100" w:type="dxa"/>
+              <w:end w:w="120" w:type="dxa"/>
+            </w:tcMar>
+          </w:tcPr>
+          <w:p>
+            <w:r>
+              <w:rPr>
+                <w:rFonts w:ascii="Calibri" w:hAnsi="Calibri" w:eastAsia="Microsoft JhengHei"/>
+                <w:b w:val="0"/>
+                <w:i w:val="0"/>
+                <w:color w:val="000000"/>
+                <w:sz w:val="22"/>
+              </w:rPr>
+              <w:t>記錄 provenance、candidate status、review、approval、activation 與 rollback</w:t>
             </w:r>
           </w:p>
         </w:tc>

</xml_diff>